<commit_message>
Add repository link and video reference to analysis document for Lab 1
</commit_message>
<xml_diff>
--- a/lab-1/Analisis_Gramatica_y_Driver.docx
+++ b/lab-1/Analisis_Gramatica_y_Driver.docx
@@ -20,9 +20,9 @@
           <w:szCs w:val="36"/>
           <w:lang w:val="es-US"/>
         </w:rPr>
-        <w:t xml:space="preserve">Análisis de la gramática </w:t>
+        <w:br/>
+        <w:t>REPOSITORIO DE GITHUB:</w:t>
       </w:r>
-      <w:proofErr w:type="spellStart"/>
       <w:r>
         <w:rPr>
           <w:b/>
@@ -31,10 +31,24 @@
           <w:szCs w:val="36"/>
           <w:lang w:val="es-US"/>
         </w:rPr>
-        <w:t>MiniLang</w:t>
+        <w:br/>
       </w:r>
-      <w:proofErr w:type="spellEnd"/>
-      <w:r>
+      <w:hyperlink r:id="rId8" w:history="1">
+        <w:r>
+          <w:rPr>
+            <w:rStyle w:val="Hyperlink"/>
+            <w:b/>
+            <w:bCs/>
+            <w:sz w:val="36"/>
+            <w:szCs w:val="36"/>
+            <w:lang w:val="es-US"/>
+          </w:rPr>
+          <w:t>https://github.com/iancumes/compilers-2026</w:t>
+        </w:r>
+      </w:hyperlink>
+    </w:p>
+    <w:p>
+      <w:pPr>
         <w:rPr>
           <w:b/>
           <w:bCs/>
@@ -42,9 +56,7 @@
           <w:szCs w:val="36"/>
           <w:lang w:val="es-US"/>
         </w:rPr>
-        <w:t xml:space="preserve"> y su </w:t>
-      </w:r>
-      <w:proofErr w:type="gramStart"/>
+      </w:pPr>
       <w:r>
         <w:rPr>
           <w:b/>
@@ -53,9 +65,94 @@
           <w:szCs w:val="36"/>
           <w:lang w:val="es-US"/>
         </w:rPr>
-        <w:t>driver</w:t>
+        <w:t xml:space="preserve">Link al video : </w:t>
       </w:r>
-      <w:proofErr w:type="gramEnd"/>
+      <w:hyperlink r:id="rId9" w:history="1">
+        <w:r>
+          <w:rPr>
+            <w:rStyle w:val="Hyperlink"/>
+            <w:b/>
+            <w:bCs/>
+            <w:sz w:val="36"/>
+            <w:szCs w:val="36"/>
+            <w:lang w:val="es-US"/>
+          </w:rPr>
+          <w:t>https://youtu.be/ZhaQVHvmwtg</w:t>
+        </w:r>
+      </w:hyperlink>
+    </w:p>
+    <w:p>
+      <w:pPr>
+        <w:rPr>
+          <w:b/>
+          <w:bCs/>
+          <w:sz w:val="36"/>
+          <w:szCs w:val="36"/>
+          <w:lang w:val="es-US"/>
+        </w:rPr>
+      </w:pPr>
+      <w:r>
+        <w:rPr>
+          <w:b/>
+          <w:bCs/>
+          <w:sz w:val="36"/>
+          <w:szCs w:val="36"/>
+          <w:lang w:val="es-US"/>
+        </w:rPr>
+        <w:br/>
+      </w:r>
+      <w:r>
+        <w:rPr>
+          <w:b/>
+          <w:bCs/>
+          <w:sz w:val="36"/>
+          <w:szCs w:val="36"/>
+          <w:lang w:val="es-US"/>
+        </w:rPr>
+        <w:br/>
+      </w:r>
+      <w:r>
+        <w:rPr>
+          <w:b/>
+          <w:bCs/>
+          <w:sz w:val="36"/>
+          <w:szCs w:val="36"/>
+          <w:lang w:val="es-US"/>
+        </w:rPr>
+        <w:br/>
+      </w:r>
+      <w:r>
+        <w:rPr>
+          <w:b/>
+          <w:bCs/>
+          <w:sz w:val="36"/>
+          <w:szCs w:val="36"/>
+          <w:lang w:val="es-US"/>
+        </w:rPr>
+        <w:t xml:space="preserve">Análisis de la gramática </w:t>
+      </w:r>
+      <w:proofErr w:type="spellStart"/>
+      <w:r>
+        <w:rPr>
+          <w:b/>
+          <w:bCs/>
+          <w:sz w:val="36"/>
+          <w:szCs w:val="36"/>
+          <w:lang w:val="es-US"/>
+        </w:rPr>
+        <w:t>MiniLang</w:t>
+      </w:r>
+      <w:proofErr w:type="spellEnd"/>
+      <w:r>
+        <w:rPr>
+          <w:b/>
+          <w:bCs/>
+          <w:sz w:val="36"/>
+          <w:szCs w:val="36"/>
+          <w:lang w:val="es-US"/>
+        </w:rPr>
+        <w:t xml:space="preserve"> y su driver</w:t>
+      </w:r>
     </w:p>
     <w:p>
       <w:pPr>
@@ -143,59 +240,7 @@
           <w:szCs w:val="32"/>
           <w:lang w:val="es-US"/>
         </w:rPr>
-        <w:t>1</w:t>
-      </w:r>
-      <w:r>
-        <w:rPr>
-          <w:b/>
-          <w:bCs/>
-          <w:sz w:val="32"/>
-          <w:szCs w:val="32"/>
-          <w:lang w:val="es-US"/>
-        </w:rPr>
-        <w:t>. Estructura de</w:t>
-      </w:r>
-      <w:r>
-        <w:rPr>
-          <w:b/>
-          <w:bCs/>
-          <w:sz w:val="32"/>
-          <w:szCs w:val="32"/>
-          <w:lang w:val="es-US"/>
-        </w:rPr>
-        <w:t>:</w:t>
-      </w:r>
-      <w:r>
-        <w:rPr>
-          <w:b/>
-          <w:bCs/>
-          <w:sz w:val="32"/>
-          <w:szCs w:val="32"/>
-          <w:lang w:val="es-US"/>
-        </w:rPr>
-        <w:t xml:space="preserve"> un </w:t>
-      </w:r>
-      <w:proofErr w:type="gramStart"/>
-      <w:r>
-        <w:rPr>
-          <w:b/>
-          <w:bCs/>
-          <w:sz w:val="32"/>
-          <w:szCs w:val="32"/>
-          <w:lang w:val="es-US"/>
-        </w:rPr>
-        <w:t>archivo .g</w:t>
-      </w:r>
-      <w:proofErr w:type="gramEnd"/>
-      <w:r>
-        <w:rPr>
-          <w:b/>
-          <w:bCs/>
-          <w:sz w:val="32"/>
-          <w:szCs w:val="32"/>
-          <w:lang w:val="es-US"/>
-        </w:rPr>
-        <w:t>4</w:t>
+        <w:t>1. Estructura de: un archivo .g4</w:t>
       </w:r>
     </w:p>
     <w:p>
@@ -208,21 +253,7 @@
         <w:rPr>
           <w:lang w:val="es-US"/>
         </w:rPr>
-        <w:t xml:space="preserve">Un </w:t>
-      </w:r>
-      <w:proofErr w:type="gramStart"/>
-      <w:r>
-        <w:rPr>
-          <w:lang w:val="es-US"/>
-        </w:rPr>
-        <w:t>archivo .g</w:t>
-      </w:r>
-      <w:proofErr w:type="gramEnd"/>
-      <w:r>
-        <w:rPr>
-          <w:lang w:val="es-US"/>
-        </w:rPr>
-        <w:t xml:space="preserve">4 contiene la especificación formal que ANTLR transforma en código. En una gramática combinada como </w:t>
+        <w:t xml:space="preserve">Un archivo .g4 contiene la especificación formal que ANTLR transforma en código. En una gramática combinada como </w:t>
       </w:r>
       <w:proofErr w:type="spellStart"/>
       <w:r>
@@ -814,9 +845,11 @@
           <w:szCs w:val="32"/>
           <w:lang w:val="es-US"/>
         </w:rPr>
-        <w:t>2</w:t>
+        <w:t>2. Análisis de las reglas sintácticas</w:t>
       </w:r>
-      <w:r>
+    </w:p>
+    <w:p>
+      <w:pPr>
         <w:rPr>
           <w:b/>
           <w:bCs/>
@@ -824,11 +857,8 @@
           <w:szCs w:val="32"/>
           <w:lang w:val="es-US"/>
         </w:rPr>
-        <w:t>. Análisis de las reglas sintácticas</w:t>
-      </w:r>
-    </w:p>
-    <w:p>
-      <w:pPr>
+      </w:pPr>
+      <w:r>
         <w:rPr>
           <w:b/>
           <w:bCs/>
@@ -836,26 +866,7 @@
           <w:szCs w:val="32"/>
           <w:lang w:val="es-US"/>
         </w:rPr>
-      </w:pPr>
-      <w:r>
-        <w:rPr>
-          <w:b/>
-          <w:bCs/>
-          <w:sz w:val="32"/>
-          <w:szCs w:val="32"/>
-          <w:lang w:val="es-US"/>
-        </w:rPr>
-        <w:t>2</w:t>
-      </w:r>
-      <w:r>
-        <w:rPr>
-          <w:b/>
-          <w:bCs/>
-          <w:sz w:val="32"/>
-          <w:szCs w:val="32"/>
-          <w:lang w:val="es-US"/>
-        </w:rPr>
-        <w:t xml:space="preserve">.1 Regla inicial: </w:t>
+        <w:t xml:space="preserve">2.1 Regla inicial: </w:t>
       </w:r>
       <w:proofErr w:type="spellStart"/>
       <w:r>
@@ -876,7 +887,6 @@
         <w:keepLines/>
         <w:shd w:val="clear" w:color="auto" w:fill="FFFFFF" w:themeFill="background1"/>
         <w:rPr>
-          <w:rFonts w:hint="eastAsia"/>
           <w:lang w:val="es-US"/>
         </w:rPr>
       </w:pPr>
@@ -905,7 +915,6 @@
         <w:t>stat</w:t>
       </w:r>
       <w:proofErr w:type="spellEnd"/>
-      <w:proofErr w:type="gramStart"/>
       <w:r>
         <w:rPr>
           <w:color w:val="1F2937"/>
@@ -913,7 +922,6 @@
         </w:rPr>
         <w:t>+ ;</w:t>
       </w:r>
-      <w:proofErr w:type="gramEnd"/>
     </w:p>
     <w:p>
       <w:pPr>
@@ -933,21 +941,7 @@
         <w:rPr>
           <w:lang w:val="es-US"/>
         </w:rPr>
-        <w:t xml:space="preserve"> es la regla inicial invocada por el </w:t>
-      </w:r>
-      <w:proofErr w:type="gramStart"/>
-      <w:r>
-        <w:rPr>
-          <w:lang w:val="es-US"/>
-        </w:rPr>
-        <w:t>driver</w:t>
-      </w:r>
-      <w:proofErr w:type="gramEnd"/>
-      <w:r>
-        <w:rPr>
-          <w:lang w:val="es-US"/>
-        </w:rPr>
-        <w:t xml:space="preserve">. El operador + significa “una o más repeticiones”; por ello, un programa válido debe contener al menos una sentencia </w:t>
+        <w:t xml:space="preserve"> es la regla inicial invocada por el driver. El operador + significa “una o más repeticiones”; por ello, un programa válido debe contener al menos una sentencia </w:t>
       </w:r>
       <w:proofErr w:type="spellStart"/>
       <w:r>
@@ -978,16 +972,8 @@
           <w:sz w:val="32"/>
           <w:szCs w:val="32"/>
         </w:rPr>
-        <w:t>2</w:t>
-      </w:r>
-      <w:r>
-        <w:rPr>
-          <w:b/>
-          <w:bCs/>
-          <w:sz w:val="32"/>
-          <w:szCs w:val="32"/>
-        </w:rPr>
-        <w:t xml:space="preserve">.2 </w:t>
+        <w:lastRenderedPageBreak/>
+        <w:t xml:space="preserve">2.2 </w:t>
       </w:r>
       <w:proofErr w:type="spellStart"/>
       <w:r>
@@ -1015,9 +1001,6 @@
         <w:pStyle w:val="Code"/>
         <w:keepLines/>
         <w:shd w:val="clear" w:color="auto" w:fill="FFFFFF" w:themeFill="background1"/>
-        <w:rPr>
-          <w:rFonts w:hint="eastAsia"/>
-        </w:rPr>
       </w:pPr>
       <w:r>
         <w:rPr>
@@ -1050,16 +1033,8 @@
         <w:rPr>
           <w:color w:val="1F2937"/>
         </w:rPr>
-        <w:t xml:space="preserve">  </w:t>
+        <w:t xml:space="preserve">    ;</w:t>
       </w:r>
-      <w:proofErr w:type="gramStart"/>
-      <w:r>
-        <w:rPr>
-          <w:color w:val="1F2937"/>
-        </w:rPr>
-        <w:t xml:space="preserve">  ;</w:t>
-      </w:r>
-      <w:proofErr w:type="gramEnd"/>
     </w:p>
     <w:p>
       <w:pPr>
@@ -1109,21 +1084,7 @@
         <w:rPr>
           <w:lang w:val="es-US"/>
         </w:rPr>
-        <w:t xml:space="preserve">: una expresión seguida de salto de línea; el nombre sugiere impresión, aunque el </w:t>
-      </w:r>
-      <w:proofErr w:type="gramStart"/>
-      <w:r>
-        <w:rPr>
-          <w:lang w:val="es-US"/>
-        </w:rPr>
-        <w:t>driver</w:t>
-      </w:r>
-      <w:proofErr w:type="gramEnd"/>
-      <w:r>
-        <w:rPr>
-          <w:lang w:val="es-US"/>
-        </w:rPr>
-        <w:t xml:space="preserve"> actual sólo valida la sintaxis.</w:t>
+        <w:t>: una expresión seguida de salto de línea; el nombre sugiere impresión, aunque el driver actual sólo valida la sintaxis.</w:t>
       </w:r>
     </w:p>
     <w:p>
@@ -1147,21 +1108,7 @@
         <w:rPr>
           <w:lang w:val="es-US"/>
         </w:rPr>
-        <w:t xml:space="preserve">: un identificador, el literal '=', una expresión y un salto de línea, por </w:t>
-      </w:r>
-      <w:proofErr w:type="gramStart"/>
-      <w:r>
-        <w:rPr>
-          <w:lang w:val="es-US"/>
-        </w:rPr>
-        <w:t>ejemplo</w:t>
-      </w:r>
-      <w:proofErr w:type="gramEnd"/>
-      <w:r>
-        <w:rPr>
-          <w:lang w:val="es-US"/>
-        </w:rPr>
-        <w:t xml:space="preserve"> a = 4.</w:t>
+        <w:t>: un identificador, el literal '=', una expresión y un salto de línea, por ejemplo a = 4.</w:t>
       </w:r>
     </w:p>
     <w:p>
@@ -1198,7 +1145,6 @@
         <w:rPr>
           <w:lang w:val="es-US"/>
         </w:rPr>
-        <w:lastRenderedPageBreak/>
         <w:t xml:space="preserve">El símbolo # asigna una etiqueta a una alternativa del </w:t>
       </w:r>
       <w:proofErr w:type="spellStart"/>
@@ -1276,17 +1222,7 @@
           <w:szCs w:val="32"/>
           <w:lang w:val="es-US"/>
         </w:rPr>
-        <w:t>2</w:t>
-      </w:r>
-      <w:r>
-        <w:rPr>
-          <w:b/>
-          <w:bCs/>
-          <w:sz w:val="32"/>
-          <w:szCs w:val="32"/>
-          <w:lang w:val="es-US"/>
-        </w:rPr>
-        <w:t>.3 Expresiones y precedencia</w:t>
+        <w:t>2.3 Expresiones y precedencia</w:t>
       </w:r>
     </w:p>
     <w:p>
@@ -1295,7 +1231,6 @@
         <w:keepLines/>
         <w:shd w:val="clear" w:color="auto" w:fill="FFFFFF" w:themeFill="background1"/>
         <w:rPr>
-          <w:rFonts w:hint="eastAsia"/>
           <w:lang w:val="es-US"/>
         </w:rPr>
       </w:pPr>
@@ -1494,17 +1429,8 @@
           <w:color w:val="1F2937"/>
           <w:lang w:val="es-US"/>
         </w:rPr>
-        <w:t xml:space="preserve">  </w:t>
+        <w:t xml:space="preserve">    ;</w:t>
       </w:r>
-      <w:proofErr w:type="gramStart"/>
-      <w:r>
-        <w:rPr>
-          <w:color w:val="1F2937"/>
-          <w:lang w:val="es-US"/>
-        </w:rPr>
-        <w:t xml:space="preserve">  ;</w:t>
-      </w:r>
-      <w:proofErr w:type="gramEnd"/>
     </w:p>
     <w:p>
       <w:pPr>
@@ -1592,17 +1518,7 @@
           <w:szCs w:val="32"/>
           <w:lang w:val="es-US"/>
         </w:rPr>
-        <w:t>3</w:t>
-      </w:r>
-      <w:r>
-        <w:rPr>
-          <w:b/>
-          <w:bCs/>
-          <w:sz w:val="32"/>
-          <w:szCs w:val="32"/>
-          <w:lang w:val="es-US"/>
-        </w:rPr>
-        <w:t>. Análisis de las reglas léxicas</w:t>
+        <w:t>3. Análisis de las reglas léxicas</w:t>
       </w:r>
     </w:p>
     <w:tbl>
@@ -2182,20 +2098,8 @@
           <w:szCs w:val="32"/>
           <w:lang w:val="es-US"/>
         </w:rPr>
-        <w:t xml:space="preserve">5. Funcionamiento del </w:t>
+        <w:t>5. Funcionamiento del driver</w:t>
       </w:r>
-      <w:proofErr w:type="gramStart"/>
-      <w:r>
-        <w:rPr>
-          <w:b/>
-          <w:bCs/>
-          <w:sz w:val="32"/>
-          <w:szCs w:val="32"/>
-          <w:lang w:val="es-US"/>
-        </w:rPr>
-        <w:t>driver</w:t>
-      </w:r>
-      <w:proofErr w:type="gramEnd"/>
     </w:p>
     <w:p>
       <w:pPr>
@@ -2346,7 +2250,6 @@
         </w:rPr>
       </w:pPr>
       <w:proofErr w:type="spellStart"/>
-      <w:proofErr w:type="gramStart"/>
       <w:r>
         <w:rPr>
           <w:lang w:val="es-US"/>
@@ -2354,7 +2257,6 @@
         <w:t>parser.prog</w:t>
       </w:r>
       <w:proofErr w:type="spellEnd"/>
-      <w:proofErr w:type="gramEnd"/>
       <w:r>
         <w:rPr>
           <w:lang w:val="es-US"/>
@@ -2376,7 +2278,6 @@
         <w:rPr>
           <w:lang w:val="es-US"/>
         </w:rPr>
-        <w:lastRenderedPageBreak/>
         <w:t>SyntaxErrorListener</w:t>
       </w:r>
       <w:proofErr w:type="spellEnd"/>
@@ -2412,21 +2313,7 @@
         <w:rPr>
           <w:lang w:val="es-US"/>
         </w:rPr>
-        <w:t xml:space="preserve">; el </w:t>
-      </w:r>
-      <w:proofErr w:type="gramStart"/>
-      <w:r>
-        <w:rPr>
-          <w:lang w:val="es-US"/>
-        </w:rPr>
-        <w:t>driver</w:t>
-      </w:r>
-      <w:proofErr w:type="gramEnd"/>
-      <w:r>
-        <w:rPr>
-          <w:lang w:val="es-US"/>
-        </w:rPr>
-        <w:t xml:space="preserve"> imprime un resumen y devuelve un código de salida.</w:t>
+        <w:t>; el driver imprime un resumen y devuelve un código de salida.</w:t>
       </w:r>
     </w:p>
     <w:p>
@@ -2437,8 +2324,8 @@
       </w:pPr>
     </w:p>
     <w:sectPr>
-      <w:headerReference w:type="default" r:id="rId8"/>
-      <w:footerReference w:type="default" r:id="rId9"/>
+      <w:headerReference w:type="default" r:id="rId10"/>
+      <w:footerReference w:type="default" r:id="rId11"/>
       <w:pgSz w:w="12240" w:h="15840"/>
       <w:pgMar w:top="1440" w:right="1440" w:bottom="1440" w:left="1440" w:header="708" w:footer="708" w:gutter="0"/>
       <w:cols w:space="720"/>
@@ -14145,6 +14032,29 @@
       <w:sz w:val="18"/>
     </w:rPr>
   </w:style>
+  <w:style w:type="character" w:styleId="Hyperlink">
+    <w:name w:val="Hyperlink"/>
+    <w:basedOn w:val="DefaultParagraphFont"/>
+    <w:uiPriority w:val="99"/>
+    <w:unhideWhenUsed/>
+    <w:rsid w:val="00AF2ECC"/>
+    <w:rPr>
+      <w:color w:val="0000FF" w:themeColor="hyperlink"/>
+      <w:u w:val="single"/>
+    </w:rPr>
+  </w:style>
+  <w:style w:type="character" w:styleId="UnresolvedMention">
+    <w:name w:val="Unresolved Mention"/>
+    <w:basedOn w:val="DefaultParagraphFont"/>
+    <w:uiPriority w:val="99"/>
+    <w:semiHidden/>
+    <w:unhideWhenUsed/>
+    <w:rsid w:val="00AF2ECC"/>
+    <w:rPr>
+      <w:color w:val="605E5C"/>
+      <w:shd w:val="clear" w:color="auto" w:fill="E1DFDD"/>
+    </w:rPr>
+  </w:style>
 </w:styles>
 </file>
 

</xml_diff>